<commit_message>
seragamkan isi: ambang ulasan, klaim transit, selisih janji, jabatan
- ambang ulasan buruk ditulis "telat 4-7 hari" di semua dokumen,
  sama dengan kelompok data dan judul grafik dasbor
- klaim lama transit dilunakkan: Parana transit lebih lama dari Sao Paulo
  tapi telatnya lebih rendah
- selisih janji "cenderung menyusut" (sempat naik Des 2017 & Jun 2018);
  perbaikan Jun tidak lagi diklaim terjadi meski janji makin ketat
- jabatan penyusun diseragamkan menjadi Analis Operasional
- laporan md/docx/pdf, presentasi, README, dan komentar SQL ikut diperbarui
</commit_message>
<xml_diff>
--- a/hasil/laporan_diagnosis_keterlambatan.docx
+++ b/hasil/laporan_diagnosis_keterlambatan.docx
@@ -1717,112 +1717,112 @@
         <w:rPr>
           <w:lang w:val="en-ID"/>
         </w:rPr>
-        <w:t>ada</w:t>
-      </w:r>
-      <w:proofErr w:type="spellEnd"/>
-      <w:r>
-        <w:rPr>
-          <w:lang w:val="en-ID"/>
-        </w:rPr>
-        <w:t xml:space="preserve"> </w:t>
-      </w:r>
-      <w:proofErr w:type="spellStart"/>
-      <w:r>
-        <w:rPr>
-          <w:lang w:val="en-ID"/>
-        </w:rPr>
-        <w:t>antara</w:t>
-      </w:r>
-      <w:proofErr w:type="spellEnd"/>
-      <w:r>
-        <w:rPr>
-          <w:lang w:val="en-ID"/>
-        </w:rPr>
-        <w:t xml:space="preserve"> </w:t>
-      </w:r>
-      <w:proofErr w:type="spellStart"/>
-      <w:r>
-        <w:rPr>
-          <w:lang w:val="en-ID"/>
-        </w:rPr>
-        <w:t>hari</w:t>
-      </w:r>
-      <w:proofErr w:type="spellEnd"/>
-      <w:r>
-        <w:rPr>
-          <w:lang w:val="en-ID"/>
-        </w:rPr>
-        <w:t xml:space="preserve"> ke-3 dan ke-7: </w:t>
-      </w:r>
-      <w:proofErr w:type="spellStart"/>
-      <w:r>
-        <w:rPr>
-          <w:lang w:val="en-ID"/>
-        </w:rPr>
-        <w:t>ulasan</w:t>
-      </w:r>
-      <w:proofErr w:type="spellEnd"/>
-      <w:r>
-        <w:rPr>
-          <w:lang w:val="en-ID"/>
-        </w:rPr>
-        <w:t xml:space="preserve"> 1–2 </w:t>
-      </w:r>
-      <w:proofErr w:type="spellStart"/>
-      <w:r>
-        <w:rPr>
-          <w:lang w:val="en-ID"/>
-        </w:rPr>
-        <w:t>bintang</w:t>
-      </w:r>
-      <w:proofErr w:type="spellEnd"/>
-      <w:r>
-        <w:rPr>
-          <w:lang w:val="en-ID"/>
-        </w:rPr>
-        <w:t xml:space="preserve"> </w:t>
-      </w:r>
-      <w:proofErr w:type="spellStart"/>
-      <w:r>
-        <w:rPr>
-          <w:lang w:val="en-ID"/>
-        </w:rPr>
-        <w:t>melonjak</w:t>
-      </w:r>
-      <w:proofErr w:type="spellEnd"/>
-      <w:r>
-        <w:rPr>
-          <w:lang w:val="en-ID"/>
-        </w:rPr>
-        <w:t xml:space="preserve"> </w:t>
-      </w:r>
-      <w:proofErr w:type="spellStart"/>
-      <w:r>
-        <w:rPr>
-          <w:lang w:val="en-ID"/>
-        </w:rPr>
-        <w:t>dari</w:t>
-      </w:r>
-      <w:proofErr w:type="spellEnd"/>
-      <w:r>
-        <w:rPr>
-          <w:lang w:val="en-ID"/>
-        </w:rPr>
-        <w:t xml:space="preserve"> 19,22% </w:t>
-      </w:r>
-      <w:proofErr w:type="spellStart"/>
-      <w:r>
-        <w:rPr>
-          <w:lang w:val="en-ID"/>
-        </w:rPr>
-        <w:t>menjadi</w:t>
-      </w:r>
-      <w:proofErr w:type="spellEnd"/>
-      <w:r>
-        <w:rPr>
-          <w:lang w:val="en-ID"/>
-        </w:rPr>
-        <w:t xml:space="preserve"> 61,25%. </w:t>
+        <w:t xml:space="preserve">ada saat telat masuk 4–7 hari: ulasan 1–2 bintang melonjak dari 19,22% (telat 1–3 hari) menjadi 61,25%</w:t>
+      </w:r>
+      <w:proofErr w:type="spellEnd"/>
+      <w:r>
+        <w:rPr>
+          <w:lang w:val="en-ID"/>
+        </w:rPr>
+        <w:t xml:space="preserve"/>
+      </w:r>
+      <w:proofErr w:type="spellStart"/>
+      <w:r>
+        <w:rPr>
+          <w:lang w:val="en-ID"/>
+        </w:rPr>
+        <w:t xml:space="preserve"/>
+      </w:r>
+      <w:proofErr w:type="spellEnd"/>
+      <w:r>
+        <w:rPr>
+          <w:lang w:val="en-ID"/>
+        </w:rPr>
+        <w:t xml:space="preserve"/>
+      </w:r>
+      <w:proofErr w:type="spellStart"/>
+      <w:r>
+        <w:rPr>
+          <w:lang w:val="en-ID"/>
+        </w:rPr>
+        <w:t xml:space="preserve"/>
+      </w:r>
+      <w:proofErr w:type="spellEnd"/>
+      <w:r>
+        <w:rPr>
+          <w:lang w:val="en-ID"/>
+        </w:rPr>
+        <w:t xml:space="preserve"/>
+      </w:r>
+      <w:proofErr w:type="spellStart"/>
+      <w:r>
+        <w:rPr>
+          <w:lang w:val="en-ID"/>
+        </w:rPr>
+        <w:t xml:space="preserve"/>
+      </w:r>
+      <w:proofErr w:type="spellEnd"/>
+      <w:r>
+        <w:rPr>
+          <w:lang w:val="en-ID"/>
+        </w:rPr>
+        <w:t xml:space="preserve"/>
+      </w:r>
+      <w:proofErr w:type="spellStart"/>
+      <w:r>
+        <w:rPr>
+          <w:lang w:val="en-ID"/>
+        </w:rPr>
+        <w:t xml:space="preserve"/>
+      </w:r>
+      <w:proofErr w:type="spellEnd"/>
+      <w:r>
+        <w:rPr>
+          <w:lang w:val="en-ID"/>
+        </w:rPr>
+        <w:t xml:space="preserve"/>
+      </w:r>
+      <w:proofErr w:type="spellStart"/>
+      <w:r>
+        <w:rPr>
+          <w:lang w:val="en-ID"/>
+        </w:rPr>
+        <w:t xml:space="preserve"/>
+      </w:r>
+      <w:proofErr w:type="spellEnd"/>
+      <w:r>
+        <w:rPr>
+          <w:lang w:val="en-ID"/>
+        </w:rPr>
+        <w:t xml:space="preserve"/>
+      </w:r>
+      <w:proofErr w:type="spellStart"/>
+      <w:r>
+        <w:rPr>
+          <w:lang w:val="en-ID"/>
+        </w:rPr>
+        <w:t xml:space="preserve"/>
+      </w:r>
+      <w:proofErr w:type="spellEnd"/>
+      <w:r>
+        <w:rPr>
+          <w:lang w:val="en-ID"/>
+        </w:rPr>
+        <w:t xml:space="preserve"/>
+      </w:r>
+      <w:proofErr w:type="spellStart"/>
+      <w:r>
+        <w:rPr>
+          <w:lang w:val="en-ID"/>
+        </w:rPr>
+        <w:t xml:space="preserve"/>
+      </w:r>
+      <w:proofErr w:type="spellEnd"/>
+      <w:r>
+        <w:rPr>
+          <w:lang w:val="en-ID"/>
+        </w:rPr>
+        <w:t xml:space="preserve">. </w:t>
       </w:r>
       <w:proofErr w:type="spellStart"/>
       <w:r>
@@ -14282,77 +14282,77 @@
         <w:rPr>
           <w:lang w:val="en-ID"/>
         </w:rPr>
-        <w:t xml:space="preserve"> 5,02% di Paraná. Yang </w:t>
-      </w:r>
-      <w:proofErr w:type="spellStart"/>
-      <w:r>
-        <w:rPr>
-          <w:lang w:val="en-ID"/>
-        </w:rPr>
-        <w:t>menentukan</w:t>
-      </w:r>
-      <w:proofErr w:type="spellEnd"/>
-      <w:r>
-        <w:rPr>
-          <w:lang w:val="en-ID"/>
-        </w:rPr>
-        <w:t xml:space="preserve"> </w:t>
-      </w:r>
-      <w:proofErr w:type="spellStart"/>
-      <w:r>
-        <w:rPr>
-          <w:lang w:val="en-ID"/>
-        </w:rPr>
-        <w:t>bukan</w:t>
-      </w:r>
-      <w:proofErr w:type="spellEnd"/>
-      <w:r>
-        <w:rPr>
-          <w:lang w:val="en-ID"/>
-        </w:rPr>
-        <w:t xml:space="preserve"> </w:t>
-      </w:r>
-      <w:proofErr w:type="spellStart"/>
-      <w:r>
-        <w:rPr>
-          <w:lang w:val="en-ID"/>
-        </w:rPr>
-        <w:t>jarak</w:t>
-      </w:r>
-      <w:proofErr w:type="spellEnd"/>
-      <w:r>
-        <w:rPr>
-          <w:lang w:val="en-ID"/>
-        </w:rPr>
-        <w:t xml:space="preserve"> </w:t>
-      </w:r>
-      <w:proofErr w:type="spellStart"/>
-      <w:r>
-        <w:rPr>
-          <w:lang w:val="en-ID"/>
-        </w:rPr>
-        <w:t>semata</w:t>
-      </w:r>
-      <w:proofErr w:type="spellEnd"/>
-      <w:r>
-        <w:rPr>
-          <w:lang w:val="en-ID"/>
-        </w:rPr>
-        <w:t xml:space="preserve">, </w:t>
-      </w:r>
-      <w:proofErr w:type="spellStart"/>
-      <w:r>
-        <w:rPr>
-          <w:lang w:val="en-ID"/>
-        </w:rPr>
-        <w:t>melainkan</w:t>
-      </w:r>
-      <w:proofErr w:type="spellEnd"/>
-      <w:r>
-        <w:rPr>
-          <w:lang w:val="en-ID"/>
-        </w:rPr>
-        <w:t xml:space="preserve"> lama transit:</w:t>
+        <w:t xml:space="preserve"> 5,02% di Paraná. Pada umumnya, provinsi dengan transit lebih lama mencatat keterlambatan lebih tinggi:</w:t>
+      </w:r>
+      <w:proofErr w:type="spellStart"/>
+      <w:r>
+        <w:rPr>
+          <w:lang w:val="en-ID"/>
+        </w:rPr>
+        <w:t xml:space="preserve"/>
+      </w:r>
+      <w:proofErr w:type="spellEnd"/>
+      <w:r>
+        <w:rPr>
+          <w:lang w:val="en-ID"/>
+        </w:rPr>
+        <w:t xml:space="preserve"/>
+      </w:r>
+      <w:proofErr w:type="spellStart"/>
+      <w:r>
+        <w:rPr>
+          <w:lang w:val="en-ID"/>
+        </w:rPr>
+        <w:t xml:space="preserve"/>
+      </w:r>
+      <w:proofErr w:type="spellEnd"/>
+      <w:r>
+        <w:rPr>
+          <w:lang w:val="en-ID"/>
+        </w:rPr>
+        <w:t xml:space="preserve"/>
+      </w:r>
+      <w:proofErr w:type="spellStart"/>
+      <w:r>
+        <w:rPr>
+          <w:lang w:val="en-ID"/>
+        </w:rPr>
+        <w:t xml:space="preserve"/>
+      </w:r>
+      <w:proofErr w:type="spellEnd"/>
+      <w:r>
+        <w:rPr>
+          <w:lang w:val="en-ID"/>
+        </w:rPr>
+        <w:t xml:space="preserve"/>
+      </w:r>
+      <w:proofErr w:type="spellStart"/>
+      <w:r>
+        <w:rPr>
+          <w:lang w:val="en-ID"/>
+        </w:rPr>
+        <w:t xml:space="preserve"/>
+      </w:r>
+      <w:proofErr w:type="spellEnd"/>
+      <w:r>
+        <w:rPr>
+          <w:lang w:val="en-ID"/>
+        </w:rPr>
+        <w:t xml:space="preserve"/>
+      </w:r>
+      <w:proofErr w:type="spellStart"/>
+      <w:r>
+        <w:rPr>
+          <w:lang w:val="en-ID"/>
+        </w:rPr>
+        <w:t xml:space="preserve"/>
+      </w:r>
+      <w:proofErr w:type="spellEnd"/>
+      <w:r>
+        <w:rPr>
+          <w:lang w:val="en-ID"/>
+        </w:rPr>
+        <w:t xml:space="preserve"/>
       </w:r>
     </w:p>
     <w:tbl>
@@ -15053,56 +15053,56 @@
         <w:rPr>
           <w:lang w:val="en-ID"/>
         </w:rPr>
-        <w:t>dengan</w:t>
-      </w:r>
-      <w:proofErr w:type="spellEnd"/>
-      <w:r>
-        <w:rPr>
-          <w:lang w:val="en-ID"/>
-        </w:rPr>
-        <w:t xml:space="preserve"> </w:t>
-      </w:r>
-      <w:proofErr w:type="spellStart"/>
-      <w:r>
-        <w:rPr>
-          <w:lang w:val="en-ID"/>
-        </w:rPr>
-        <w:t>kinerja</w:t>
-      </w:r>
-      <w:proofErr w:type="spellEnd"/>
-      <w:r>
-        <w:rPr>
-          <w:lang w:val="en-ID"/>
-        </w:rPr>
-        <w:t xml:space="preserve"> </w:t>
-      </w:r>
-      <w:proofErr w:type="spellStart"/>
-      <w:r>
-        <w:rPr>
-          <w:lang w:val="en-ID"/>
-        </w:rPr>
-        <w:t>terbaik</w:t>
-      </w:r>
-      <w:proofErr w:type="spellEnd"/>
-      <w:r>
-        <w:rPr>
-          <w:lang w:val="en-ID"/>
-        </w:rPr>
-        <w:t xml:space="preserve"> </w:t>
-      </w:r>
-      <w:proofErr w:type="spellStart"/>
-      <w:r>
-        <w:rPr>
-          <w:lang w:val="en-ID"/>
-        </w:rPr>
-        <w:t>kedua</w:t>
-      </w:r>
-      <w:proofErr w:type="spellEnd"/>
-      <w:r>
-        <w:rPr>
-          <w:lang w:val="en-ID"/>
-        </w:rPr>
-        <w:t>.</w:t>
+        <w:t xml:space="preserve">dengan kinerja terbaik kedua. Namun lama transit bukan satu-satunya faktor: Paraná transitnya lebih lama dari São Paulo (7,18 vs 4,42 hari), tetapi tingkat keterlambatannya justru lebih rendah.</w:t>
+      </w:r>
+      <w:proofErr w:type="spellEnd"/>
+      <w:r>
+        <w:rPr>
+          <w:lang w:val="en-ID"/>
+        </w:rPr>
+        <w:t xml:space="preserve"/>
+      </w:r>
+      <w:proofErr w:type="spellStart"/>
+      <w:r>
+        <w:rPr>
+          <w:lang w:val="en-ID"/>
+        </w:rPr>
+        <w:t xml:space="preserve"/>
+      </w:r>
+      <w:proofErr w:type="spellEnd"/>
+      <w:r>
+        <w:rPr>
+          <w:lang w:val="en-ID"/>
+        </w:rPr>
+        <w:t xml:space="preserve"/>
+      </w:r>
+      <w:proofErr w:type="spellStart"/>
+      <w:r>
+        <w:rPr>
+          <w:lang w:val="en-ID"/>
+        </w:rPr>
+        <w:t xml:space="preserve"/>
+      </w:r>
+      <w:proofErr w:type="spellEnd"/>
+      <w:r>
+        <w:rPr>
+          <w:lang w:val="en-ID"/>
+        </w:rPr>
+        <w:t xml:space="preserve"/>
+      </w:r>
+      <w:proofErr w:type="spellStart"/>
+      <w:r>
+        <w:rPr>
+          <w:lang w:val="en-ID"/>
+        </w:rPr>
+        <w:t xml:space="preserve"/>
+      </w:r>
+      <w:proofErr w:type="spellEnd"/>
+      <w:r>
+        <w:rPr>
+          <w:lang w:val="en-ID"/>
+        </w:rPr>
+        <w:t xml:space="preserve"/>
       </w:r>
     </w:p>
     <w:p>
@@ -17225,112 +17225,112 @@
         <w:rPr>
           <w:lang w:val="en-ID"/>
         </w:rPr>
-        <w:t>menyusut</w:t>
-      </w:r>
-      <w:proofErr w:type="spellEnd"/>
-      <w:r>
-        <w:rPr>
-          <w:lang w:val="en-ID"/>
-        </w:rPr>
-        <w:t xml:space="preserve"> </w:t>
-      </w:r>
-      <w:proofErr w:type="spellStart"/>
-      <w:r>
-        <w:rPr>
-          <w:lang w:val="en-ID"/>
-        </w:rPr>
-        <w:t>terus</w:t>
-      </w:r>
-      <w:proofErr w:type="spellEnd"/>
-      <w:r>
-        <w:rPr>
-          <w:lang w:val="en-ID"/>
-        </w:rPr>
-        <w:t xml:space="preserve">, </w:t>
-      </w:r>
-      <w:proofErr w:type="spellStart"/>
-      <w:r>
-        <w:rPr>
-          <w:lang w:val="en-ID"/>
-        </w:rPr>
-        <w:t>dari</w:t>
-      </w:r>
-      <w:proofErr w:type="spellEnd"/>
-      <w:r>
-        <w:rPr>
-          <w:lang w:val="en-ID"/>
-        </w:rPr>
-        <w:t xml:space="preserve"> 39,0 </w:t>
-      </w:r>
-      <w:proofErr w:type="spellStart"/>
-      <w:r>
-        <w:rPr>
-          <w:lang w:val="en-ID"/>
-        </w:rPr>
-        <w:t>hari</w:t>
-      </w:r>
-      <w:proofErr w:type="spellEnd"/>
-      <w:r>
-        <w:rPr>
-          <w:lang w:val="en-ID"/>
-        </w:rPr>
-        <w:t xml:space="preserve"> pada Jan 2017 </w:t>
-      </w:r>
-      <w:proofErr w:type="spellStart"/>
-      <w:r>
-        <w:rPr>
-          <w:lang w:val="en-ID"/>
-        </w:rPr>
-        <w:t>menjadi</w:t>
-      </w:r>
-      <w:proofErr w:type="spellEnd"/>
-      <w:r>
-        <w:rPr>
-          <w:lang w:val="en-ID"/>
-        </w:rPr>
-        <w:t xml:space="preserve"> 13,4 </w:t>
-      </w:r>
-      <w:proofErr w:type="spellStart"/>
-      <w:r>
-        <w:rPr>
-          <w:lang w:val="en-ID"/>
-        </w:rPr>
-        <w:t>hari</w:t>
-      </w:r>
-      <w:proofErr w:type="spellEnd"/>
-      <w:r>
-        <w:rPr>
-          <w:lang w:val="en-ID"/>
-        </w:rPr>
-        <w:t xml:space="preserve"> pada </w:t>
-      </w:r>
-      <w:proofErr w:type="spellStart"/>
-      <w:r>
-        <w:rPr>
-          <w:lang w:val="en-ID"/>
-        </w:rPr>
-        <w:t>Ags</w:t>
-      </w:r>
-      <w:proofErr w:type="spellEnd"/>
-      <w:r>
-        <w:rPr>
-          <w:lang w:val="en-ID"/>
-        </w:rPr>
-        <w:t xml:space="preserve"> 2018 — </w:t>
-      </w:r>
-      <w:proofErr w:type="spellStart"/>
-      <w:r>
-        <w:rPr>
-          <w:lang w:val="en-ID"/>
-        </w:rPr>
-        <w:t>turun</w:t>
-      </w:r>
-      <w:proofErr w:type="spellEnd"/>
-      <w:r>
-        <w:rPr>
-          <w:lang w:val="en-ID"/>
-        </w:rPr>
-        <w:t xml:space="preserve"> 66%. </w:t>
+        <w:t xml:space="preserve">cenderung menyusut, dari 39,0 hari pada Jan 2017 menjadi 13,4 hari pada Ags 2018 — turun 66%, meski sempat naik lagi pada Des 2017 dan Jun 2018.</w:t>
+      </w:r>
+      <w:proofErr w:type="spellEnd"/>
+      <w:r>
+        <w:rPr>
+          <w:lang w:val="en-ID"/>
+        </w:rPr>
+        <w:t xml:space="preserve"/>
+      </w:r>
+      <w:proofErr w:type="spellStart"/>
+      <w:r>
+        <w:rPr>
+          <w:lang w:val="en-ID"/>
+        </w:rPr>
+        <w:t xml:space="preserve"/>
+      </w:r>
+      <w:proofErr w:type="spellEnd"/>
+      <w:r>
+        <w:rPr>
+          <w:lang w:val="en-ID"/>
+        </w:rPr>
+        <w:t xml:space="preserve"/>
+      </w:r>
+      <w:proofErr w:type="spellStart"/>
+      <w:r>
+        <w:rPr>
+          <w:lang w:val="en-ID"/>
+        </w:rPr>
+        <w:t xml:space="preserve"/>
+      </w:r>
+      <w:proofErr w:type="spellEnd"/>
+      <w:r>
+        <w:rPr>
+          <w:lang w:val="en-ID"/>
+        </w:rPr>
+        <w:t xml:space="preserve"/>
+      </w:r>
+      <w:proofErr w:type="spellStart"/>
+      <w:r>
+        <w:rPr>
+          <w:lang w:val="en-ID"/>
+        </w:rPr>
+        <w:t xml:space="preserve"/>
+      </w:r>
+      <w:proofErr w:type="spellEnd"/>
+      <w:r>
+        <w:rPr>
+          <w:lang w:val="en-ID"/>
+        </w:rPr>
+        <w:t xml:space="preserve"/>
+      </w:r>
+      <w:proofErr w:type="spellStart"/>
+      <w:r>
+        <w:rPr>
+          <w:lang w:val="en-ID"/>
+        </w:rPr>
+        <w:t xml:space="preserve"/>
+      </w:r>
+      <w:proofErr w:type="spellEnd"/>
+      <w:r>
+        <w:rPr>
+          <w:lang w:val="en-ID"/>
+        </w:rPr>
+        <w:t xml:space="preserve"/>
+      </w:r>
+      <w:proofErr w:type="spellStart"/>
+      <w:r>
+        <w:rPr>
+          <w:lang w:val="en-ID"/>
+        </w:rPr>
+        <w:t xml:space="preserve"/>
+      </w:r>
+      <w:proofErr w:type="spellEnd"/>
+      <w:r>
+        <w:rPr>
+          <w:lang w:val="en-ID"/>
+        </w:rPr>
+        <w:t xml:space="preserve"/>
+      </w:r>
+      <w:proofErr w:type="spellStart"/>
+      <w:r>
+        <w:rPr>
+          <w:lang w:val="en-ID"/>
+        </w:rPr>
+        <w:t xml:space="preserve"/>
+      </w:r>
+      <w:proofErr w:type="spellEnd"/>
+      <w:r>
+        <w:rPr>
+          <w:lang w:val="en-ID"/>
+        </w:rPr>
+        <w:t xml:space="preserve"/>
+      </w:r>
+      <w:proofErr w:type="spellStart"/>
+      <w:r>
+        <w:rPr>
+          <w:lang w:val="en-ID"/>
+        </w:rPr>
+        <w:t xml:space="preserve"/>
+      </w:r>
+      <w:proofErr w:type="spellEnd"/>
+      <w:r>
+        <w:rPr>
+          <w:lang w:val="en-ID"/>
+        </w:rPr>
+        <w:t xml:space="preserve"> </w:t>
       </w:r>
       <w:proofErr w:type="spellStart"/>
       <w:r>
@@ -17682,231 +17682,231 @@
         <w:rPr>
           <w:lang w:val="en-ID"/>
         </w:rPr>
-        <w:t xml:space="preserve"> 1,36%. Yang </w:t>
-      </w:r>
-      <w:proofErr w:type="spellStart"/>
-      <w:r>
-        <w:rPr>
-          <w:lang w:val="en-ID"/>
-        </w:rPr>
-        <w:t>penting</w:t>
-      </w:r>
-      <w:proofErr w:type="spellEnd"/>
-      <w:r>
-        <w:rPr>
-          <w:lang w:val="en-ID"/>
-        </w:rPr>
-        <w:t xml:space="preserve">, </w:t>
-      </w:r>
-      <w:proofErr w:type="spellStart"/>
-      <w:r>
-        <w:rPr>
-          <w:lang w:val="en-ID"/>
-        </w:rPr>
-        <w:t>perbaikan</w:t>
-      </w:r>
-      <w:proofErr w:type="spellEnd"/>
-      <w:r>
-        <w:rPr>
-          <w:lang w:val="en-ID"/>
-        </w:rPr>
-        <w:t xml:space="preserve"> </w:t>
-      </w:r>
-      <w:proofErr w:type="spellStart"/>
-      <w:r>
-        <w:rPr>
-          <w:lang w:val="en-ID"/>
-        </w:rPr>
-        <w:t>ini</w:t>
-      </w:r>
-      <w:proofErr w:type="spellEnd"/>
-      <w:r>
-        <w:rPr>
-          <w:lang w:val="en-ID"/>
-        </w:rPr>
-        <w:t xml:space="preserve"> </w:t>
-      </w:r>
-      <w:proofErr w:type="spellStart"/>
-      <w:r>
-        <w:rPr>
-          <w:lang w:val="en-ID"/>
-        </w:rPr>
-        <w:t>terjadi</w:t>
-      </w:r>
-      <w:proofErr w:type="spellEnd"/>
-      <w:r>
-        <w:rPr>
-          <w:lang w:val="en-ID"/>
-        </w:rPr>
-        <w:t xml:space="preserve"> </w:t>
-      </w:r>
-      <w:proofErr w:type="spellStart"/>
-      <w:r>
-        <w:rPr>
-          <w:lang w:val="en-ID"/>
-        </w:rPr>
-        <w:t>meskipun</w:t>
-      </w:r>
-      <w:proofErr w:type="spellEnd"/>
-      <w:r>
-        <w:rPr>
-          <w:lang w:val="en-ID"/>
-        </w:rPr>
-        <w:t xml:space="preserve"> </w:t>
-      </w:r>
-      <w:proofErr w:type="spellStart"/>
-      <w:r>
-        <w:rPr>
-          <w:lang w:val="en-ID"/>
-        </w:rPr>
-        <w:t>janjinya</w:t>
-      </w:r>
-      <w:proofErr w:type="spellEnd"/>
-      <w:r>
-        <w:rPr>
-          <w:lang w:val="en-ID"/>
-        </w:rPr>
-        <w:t xml:space="preserve"> </w:t>
-      </w:r>
-      <w:proofErr w:type="spellStart"/>
-      <w:r>
-        <w:rPr>
-          <w:lang w:val="en-ID"/>
-        </w:rPr>
-        <w:t>makin</w:t>
-      </w:r>
-      <w:proofErr w:type="spellEnd"/>
-      <w:r>
-        <w:rPr>
-          <w:lang w:val="en-ID"/>
-        </w:rPr>
-        <w:t xml:space="preserve"> </w:t>
-      </w:r>
-      <w:proofErr w:type="spellStart"/>
-      <w:r>
-        <w:rPr>
-          <w:lang w:val="en-ID"/>
-        </w:rPr>
-        <w:t>ketat</w:t>
-      </w:r>
-      <w:proofErr w:type="spellEnd"/>
-      <w:r>
-        <w:rPr>
-          <w:lang w:val="en-ID"/>
-        </w:rPr>
-        <w:t xml:space="preserve"> — </w:t>
-      </w:r>
-      <w:proofErr w:type="spellStart"/>
-      <w:r>
-        <w:rPr>
-          <w:lang w:val="en-ID"/>
-        </w:rPr>
-        <w:t>jadi</w:t>
-      </w:r>
-      <w:proofErr w:type="spellEnd"/>
-      <w:r>
-        <w:rPr>
-          <w:lang w:val="en-ID"/>
-        </w:rPr>
-        <w:t xml:space="preserve"> </w:t>
-      </w:r>
-      <w:proofErr w:type="spellStart"/>
-      <w:r>
-        <w:rPr>
-          <w:lang w:val="en-ID"/>
-        </w:rPr>
-        <w:t>ini</w:t>
-      </w:r>
-      <w:proofErr w:type="spellEnd"/>
-      <w:r>
-        <w:rPr>
-          <w:lang w:val="en-ID"/>
-        </w:rPr>
-        <w:t xml:space="preserve"> </w:t>
-      </w:r>
-      <w:proofErr w:type="spellStart"/>
-      <w:r>
-        <w:rPr>
-          <w:lang w:val="en-ID"/>
-        </w:rPr>
-        <w:t>hasil</w:t>
-      </w:r>
-      <w:proofErr w:type="spellEnd"/>
-      <w:r>
-        <w:rPr>
-          <w:lang w:val="en-ID"/>
-        </w:rPr>
-        <w:t xml:space="preserve"> </w:t>
-      </w:r>
-      <w:proofErr w:type="spellStart"/>
-      <w:r>
-        <w:rPr>
-          <w:lang w:val="en-ID"/>
-        </w:rPr>
-        <w:t>operasional</w:t>
-      </w:r>
-      <w:proofErr w:type="spellEnd"/>
-      <w:r>
-        <w:rPr>
-          <w:lang w:val="en-ID"/>
-        </w:rPr>
-        <w:t xml:space="preserve"> yang </w:t>
-      </w:r>
-      <w:proofErr w:type="spellStart"/>
-      <w:r>
-        <w:rPr>
-          <w:lang w:val="en-ID"/>
-        </w:rPr>
-        <w:t>nyata</w:t>
-      </w:r>
-      <w:proofErr w:type="spellEnd"/>
-      <w:r>
-        <w:rPr>
-          <w:lang w:val="en-ID"/>
-        </w:rPr>
-        <w:t xml:space="preserve">, </w:t>
-      </w:r>
-      <w:proofErr w:type="spellStart"/>
-      <w:r>
-        <w:rPr>
-          <w:lang w:val="en-ID"/>
-        </w:rPr>
-        <w:t>bukan</w:t>
-      </w:r>
-      <w:proofErr w:type="spellEnd"/>
-      <w:r>
-        <w:rPr>
-          <w:lang w:val="en-ID"/>
-        </w:rPr>
-        <w:t xml:space="preserve"> </w:t>
-      </w:r>
-      <w:proofErr w:type="spellStart"/>
-      <w:r>
-        <w:rPr>
-          <w:lang w:val="en-ID"/>
-        </w:rPr>
-        <w:t>hasil</w:t>
-      </w:r>
-      <w:proofErr w:type="spellEnd"/>
-      <w:r>
-        <w:rPr>
-          <w:lang w:val="en-ID"/>
-        </w:rPr>
-        <w:t xml:space="preserve"> </w:t>
-      </w:r>
-      <w:proofErr w:type="spellStart"/>
-      <w:r>
-        <w:rPr>
-          <w:lang w:val="en-ID"/>
-        </w:rPr>
-        <w:t>melonggarkan</w:t>
-      </w:r>
-      <w:proofErr w:type="spellEnd"/>
-      <w:r>
-        <w:rPr>
-          <w:lang w:val="en-ID"/>
-        </w:rPr>
-        <w:t xml:space="preserve"> target.</w:t>
+        <w:t xml:space="preserve"> 1,36%. Pada Apr dan Mei, selisih janji berada di kisaran yang sama dengan sebelum krisis, jadi perbaikan di dua bulan itu bukan hasil melonggarkan target. Namun titik terbaik Jun bertepatan dengan janji yang kembali dilonggarkan, sehingga sebagian perbaikan di bulan itu kemungkinan ikut terbantu oleh target yang lebih longgar.</w:t>
+      </w:r>
+      <w:proofErr w:type="spellStart"/>
+      <w:r>
+        <w:rPr>
+          <w:lang w:val="en-ID"/>
+        </w:rPr>
+        <w:t xml:space="preserve"/>
+      </w:r>
+      <w:proofErr w:type="spellEnd"/>
+      <w:r>
+        <w:rPr>
+          <w:lang w:val="en-ID"/>
+        </w:rPr>
+        <w:t xml:space="preserve"/>
+      </w:r>
+      <w:proofErr w:type="spellStart"/>
+      <w:r>
+        <w:rPr>
+          <w:lang w:val="en-ID"/>
+        </w:rPr>
+        <w:t xml:space="preserve"/>
+      </w:r>
+      <w:proofErr w:type="spellEnd"/>
+      <w:r>
+        <w:rPr>
+          <w:lang w:val="en-ID"/>
+        </w:rPr>
+        <w:t xml:space="preserve"/>
+      </w:r>
+      <w:proofErr w:type="spellStart"/>
+      <w:r>
+        <w:rPr>
+          <w:lang w:val="en-ID"/>
+        </w:rPr>
+        <w:t xml:space="preserve"/>
+      </w:r>
+      <w:proofErr w:type="spellEnd"/>
+      <w:r>
+        <w:rPr>
+          <w:lang w:val="en-ID"/>
+        </w:rPr>
+        <w:t xml:space="preserve"/>
+      </w:r>
+      <w:proofErr w:type="spellStart"/>
+      <w:r>
+        <w:rPr>
+          <w:lang w:val="en-ID"/>
+        </w:rPr>
+        <w:t xml:space="preserve"/>
+      </w:r>
+      <w:proofErr w:type="spellEnd"/>
+      <w:r>
+        <w:rPr>
+          <w:lang w:val="en-ID"/>
+        </w:rPr>
+        <w:t xml:space="preserve"/>
+      </w:r>
+      <w:proofErr w:type="spellStart"/>
+      <w:r>
+        <w:rPr>
+          <w:lang w:val="en-ID"/>
+        </w:rPr>
+        <w:t xml:space="preserve"/>
+      </w:r>
+      <w:proofErr w:type="spellEnd"/>
+      <w:r>
+        <w:rPr>
+          <w:lang w:val="en-ID"/>
+        </w:rPr>
+        <w:t xml:space="preserve"/>
+      </w:r>
+      <w:proofErr w:type="spellStart"/>
+      <w:r>
+        <w:rPr>
+          <w:lang w:val="en-ID"/>
+        </w:rPr>
+        <w:t xml:space="preserve"/>
+      </w:r>
+      <w:proofErr w:type="spellEnd"/>
+      <w:r>
+        <w:rPr>
+          <w:lang w:val="en-ID"/>
+        </w:rPr>
+        <w:t xml:space="preserve"/>
+      </w:r>
+      <w:proofErr w:type="spellStart"/>
+      <w:r>
+        <w:rPr>
+          <w:lang w:val="en-ID"/>
+        </w:rPr>
+        <w:t xml:space="preserve"/>
+      </w:r>
+      <w:proofErr w:type="spellEnd"/>
+      <w:r>
+        <w:rPr>
+          <w:lang w:val="en-ID"/>
+        </w:rPr>
+        <w:t xml:space="preserve"/>
+      </w:r>
+      <w:proofErr w:type="spellStart"/>
+      <w:r>
+        <w:rPr>
+          <w:lang w:val="en-ID"/>
+        </w:rPr>
+        <w:t xml:space="preserve"/>
+      </w:r>
+      <w:proofErr w:type="spellEnd"/>
+      <w:r>
+        <w:rPr>
+          <w:lang w:val="en-ID"/>
+        </w:rPr>
+        <w:t xml:space="preserve"/>
+      </w:r>
+      <w:proofErr w:type="spellStart"/>
+      <w:r>
+        <w:rPr>
+          <w:lang w:val="en-ID"/>
+        </w:rPr>
+        <w:t xml:space="preserve"/>
+      </w:r>
+      <w:proofErr w:type="spellEnd"/>
+      <w:r>
+        <w:rPr>
+          <w:lang w:val="en-ID"/>
+        </w:rPr>
+        <w:t xml:space="preserve"/>
+      </w:r>
+      <w:proofErr w:type="spellStart"/>
+      <w:r>
+        <w:rPr>
+          <w:lang w:val="en-ID"/>
+        </w:rPr>
+        <w:t xml:space="preserve"/>
+      </w:r>
+      <w:proofErr w:type="spellEnd"/>
+      <w:r>
+        <w:rPr>
+          <w:lang w:val="en-ID"/>
+        </w:rPr>
+        <w:t xml:space="preserve"/>
+      </w:r>
+      <w:proofErr w:type="spellStart"/>
+      <w:r>
+        <w:rPr>
+          <w:lang w:val="en-ID"/>
+        </w:rPr>
+        <w:t xml:space="preserve"/>
+      </w:r>
+      <w:proofErr w:type="spellEnd"/>
+      <w:r>
+        <w:rPr>
+          <w:lang w:val="en-ID"/>
+        </w:rPr>
+        <w:t xml:space="preserve"/>
+      </w:r>
+      <w:proofErr w:type="spellStart"/>
+      <w:r>
+        <w:rPr>
+          <w:lang w:val="en-ID"/>
+        </w:rPr>
+        <w:t xml:space="preserve"/>
+      </w:r>
+      <w:proofErr w:type="spellEnd"/>
+      <w:r>
+        <w:rPr>
+          <w:lang w:val="en-ID"/>
+        </w:rPr>
+        <w:t xml:space="preserve"/>
+      </w:r>
+      <w:proofErr w:type="spellStart"/>
+      <w:r>
+        <w:rPr>
+          <w:lang w:val="en-ID"/>
+        </w:rPr>
+        <w:t xml:space="preserve"/>
+      </w:r>
+      <w:proofErr w:type="spellEnd"/>
+      <w:r>
+        <w:rPr>
+          <w:lang w:val="en-ID"/>
+        </w:rPr>
+        <w:t xml:space="preserve"/>
+      </w:r>
+      <w:proofErr w:type="spellStart"/>
+      <w:r>
+        <w:rPr>
+          <w:lang w:val="en-ID"/>
+        </w:rPr>
+        <w:t xml:space="preserve"/>
+      </w:r>
+      <w:proofErr w:type="spellEnd"/>
+      <w:r>
+        <w:rPr>
+          <w:lang w:val="en-ID"/>
+        </w:rPr>
+        <w:t xml:space="preserve"/>
+      </w:r>
+      <w:proofErr w:type="spellStart"/>
+      <w:r>
+        <w:rPr>
+          <w:lang w:val="en-ID"/>
+        </w:rPr>
+        <w:t xml:space="preserve"/>
+      </w:r>
+      <w:proofErr w:type="spellEnd"/>
+      <w:r>
+        <w:rPr>
+          <w:lang w:val="en-ID"/>
+        </w:rPr>
+        <w:t xml:space="preserve"/>
+      </w:r>
+      <w:proofErr w:type="spellStart"/>
+      <w:r>
+        <w:rPr>
+          <w:lang w:val="en-ID"/>
+        </w:rPr>
+        <w:t xml:space="preserve"/>
+      </w:r>
+      <w:proofErr w:type="spellEnd"/>
+      <w:r>
+        <w:rPr>
+          <w:lang w:val="en-ID"/>
+        </w:rPr>
+        <w:t xml:space="preserve"/>
       </w:r>
     </w:p>
     <w:p>
@@ -21624,140 +21624,140 @@
         <w:rPr>
           <w:lang w:val="en-ID"/>
         </w:rPr>
-        <w:t>berada</w:t>
-      </w:r>
-      <w:proofErr w:type="spellEnd"/>
-      <w:r>
-        <w:rPr>
-          <w:lang w:val="en-ID"/>
-        </w:rPr>
-        <w:t xml:space="preserve"> </w:t>
-      </w:r>
-      <w:proofErr w:type="spellStart"/>
-      <w:r>
-        <w:rPr>
-          <w:lang w:val="en-ID"/>
-        </w:rPr>
-        <w:t>antara</w:t>
-      </w:r>
-      <w:proofErr w:type="spellEnd"/>
-      <w:r>
-        <w:rPr>
-          <w:lang w:val="en-ID"/>
-        </w:rPr>
-        <w:t xml:space="preserve"> </w:t>
-      </w:r>
-      <w:proofErr w:type="spellStart"/>
-      <w:r>
-        <w:rPr>
-          <w:lang w:val="en-ID"/>
-        </w:rPr>
-        <w:t>hari</w:t>
-      </w:r>
-      <w:proofErr w:type="spellEnd"/>
-      <w:r>
-        <w:rPr>
-          <w:lang w:val="en-ID"/>
-        </w:rPr>
-        <w:t xml:space="preserve"> ke-3 dan ke-7: </w:t>
-      </w:r>
-      <w:proofErr w:type="spellStart"/>
-      <w:r>
-        <w:rPr>
-          <w:lang w:val="en-ID"/>
-        </w:rPr>
-        <w:t>ulasan</w:t>
-      </w:r>
-      <w:proofErr w:type="spellEnd"/>
-      <w:r>
-        <w:rPr>
-          <w:lang w:val="en-ID"/>
-        </w:rPr>
-        <w:t xml:space="preserve"> </w:t>
-      </w:r>
-      <w:proofErr w:type="spellStart"/>
-      <w:r>
-        <w:rPr>
-          <w:lang w:val="en-ID"/>
-        </w:rPr>
-        <w:t>buruk</w:t>
-      </w:r>
-      <w:proofErr w:type="spellEnd"/>
-      <w:r>
-        <w:rPr>
-          <w:lang w:val="en-ID"/>
-        </w:rPr>
-        <w:t xml:space="preserve"> </w:t>
-      </w:r>
-      <w:proofErr w:type="spellStart"/>
-      <w:r>
-        <w:rPr>
-          <w:lang w:val="en-ID"/>
-        </w:rPr>
-        <w:t>melompat</w:t>
-      </w:r>
-      <w:proofErr w:type="spellEnd"/>
-      <w:r>
-        <w:rPr>
-          <w:lang w:val="en-ID"/>
-        </w:rPr>
-        <w:t xml:space="preserve"> </w:t>
-      </w:r>
-      <w:proofErr w:type="spellStart"/>
-      <w:r>
-        <w:rPr>
-          <w:lang w:val="en-ID"/>
-        </w:rPr>
-        <w:t>tiga</w:t>
-      </w:r>
-      <w:proofErr w:type="spellEnd"/>
-      <w:r>
-        <w:rPr>
-          <w:lang w:val="en-ID"/>
-        </w:rPr>
-        <w:t xml:space="preserve"> kali </w:t>
-      </w:r>
-      <w:proofErr w:type="spellStart"/>
-      <w:r>
-        <w:rPr>
-          <w:lang w:val="en-ID"/>
-        </w:rPr>
-        <w:t>lipat</w:t>
-      </w:r>
-      <w:proofErr w:type="spellEnd"/>
-      <w:r>
-        <w:rPr>
-          <w:lang w:val="en-ID"/>
-        </w:rPr>
-        <w:t xml:space="preserve">, </w:t>
-      </w:r>
-      <w:proofErr w:type="spellStart"/>
-      <w:r>
-        <w:rPr>
-          <w:lang w:val="en-ID"/>
-        </w:rPr>
-        <w:t>dari</w:t>
-      </w:r>
-      <w:proofErr w:type="spellEnd"/>
-      <w:r>
-        <w:rPr>
-          <w:lang w:val="en-ID"/>
-        </w:rPr>
-        <w:t xml:space="preserve"> 19,22% </w:t>
-      </w:r>
-      <w:proofErr w:type="spellStart"/>
-      <w:r>
-        <w:rPr>
-          <w:lang w:val="en-ID"/>
-        </w:rPr>
-        <w:t>ke</w:t>
-      </w:r>
-      <w:proofErr w:type="spellEnd"/>
-      <w:r>
-        <w:rPr>
-          <w:lang w:val="en-ID"/>
-        </w:rPr>
-        <w:t xml:space="preserve"> 61,25%. </w:t>
+        <w:t xml:space="preserve">berada pada kelompok telat 4–7 hari: ulasan buruk melompat tiga kali lipat, dari 19,22% pada telat 1–3 hari ke 61,25%.</w:t>
+      </w:r>
+      <w:proofErr w:type="spellEnd"/>
+      <w:r>
+        <w:rPr>
+          <w:lang w:val="en-ID"/>
+        </w:rPr>
+        <w:t xml:space="preserve"/>
+      </w:r>
+      <w:proofErr w:type="spellStart"/>
+      <w:r>
+        <w:rPr>
+          <w:lang w:val="en-ID"/>
+        </w:rPr>
+        <w:t xml:space="preserve"/>
+      </w:r>
+      <w:proofErr w:type="spellEnd"/>
+      <w:r>
+        <w:rPr>
+          <w:lang w:val="en-ID"/>
+        </w:rPr>
+        <w:t xml:space="preserve"/>
+      </w:r>
+      <w:proofErr w:type="spellStart"/>
+      <w:r>
+        <w:rPr>
+          <w:lang w:val="en-ID"/>
+        </w:rPr>
+        <w:t xml:space="preserve"/>
+      </w:r>
+      <w:proofErr w:type="spellEnd"/>
+      <w:r>
+        <w:rPr>
+          <w:lang w:val="en-ID"/>
+        </w:rPr>
+        <w:t xml:space="preserve"/>
+      </w:r>
+      <w:proofErr w:type="spellStart"/>
+      <w:r>
+        <w:rPr>
+          <w:lang w:val="en-ID"/>
+        </w:rPr>
+        <w:t xml:space="preserve"/>
+      </w:r>
+      <w:proofErr w:type="spellEnd"/>
+      <w:r>
+        <w:rPr>
+          <w:lang w:val="en-ID"/>
+        </w:rPr>
+        <w:t xml:space="preserve"/>
+      </w:r>
+      <w:proofErr w:type="spellStart"/>
+      <w:r>
+        <w:rPr>
+          <w:lang w:val="en-ID"/>
+        </w:rPr>
+        <w:t xml:space="preserve"/>
+      </w:r>
+      <w:proofErr w:type="spellEnd"/>
+      <w:r>
+        <w:rPr>
+          <w:lang w:val="en-ID"/>
+        </w:rPr>
+        <w:t xml:space="preserve"/>
+      </w:r>
+      <w:proofErr w:type="spellStart"/>
+      <w:r>
+        <w:rPr>
+          <w:lang w:val="en-ID"/>
+        </w:rPr>
+        <w:t xml:space="preserve"/>
+      </w:r>
+      <w:proofErr w:type="spellEnd"/>
+      <w:r>
+        <w:rPr>
+          <w:lang w:val="en-ID"/>
+        </w:rPr>
+        <w:t xml:space="preserve"/>
+      </w:r>
+      <w:proofErr w:type="spellStart"/>
+      <w:r>
+        <w:rPr>
+          <w:lang w:val="en-ID"/>
+        </w:rPr>
+        <w:t xml:space="preserve"/>
+      </w:r>
+      <w:proofErr w:type="spellEnd"/>
+      <w:r>
+        <w:rPr>
+          <w:lang w:val="en-ID"/>
+        </w:rPr>
+        <w:t xml:space="preserve"/>
+      </w:r>
+      <w:proofErr w:type="spellStart"/>
+      <w:r>
+        <w:rPr>
+          <w:lang w:val="en-ID"/>
+        </w:rPr>
+        <w:t xml:space="preserve"/>
+      </w:r>
+      <w:proofErr w:type="spellEnd"/>
+      <w:r>
+        <w:rPr>
+          <w:lang w:val="en-ID"/>
+        </w:rPr>
+        <w:t xml:space="preserve"/>
+      </w:r>
+      <w:proofErr w:type="spellStart"/>
+      <w:r>
+        <w:rPr>
+          <w:lang w:val="en-ID"/>
+        </w:rPr>
+        <w:t xml:space="preserve"/>
+      </w:r>
+      <w:proofErr w:type="spellEnd"/>
+      <w:r>
+        <w:rPr>
+          <w:lang w:val="en-ID"/>
+        </w:rPr>
+        <w:t xml:space="preserve"/>
+      </w:r>
+      <w:proofErr w:type="spellStart"/>
+      <w:r>
+        <w:rPr>
+          <w:lang w:val="en-ID"/>
+        </w:rPr>
+        <w:t xml:space="preserve"/>
+      </w:r>
+      <w:proofErr w:type="spellEnd"/>
+      <w:r>
+        <w:rPr>
+          <w:lang w:val="en-ID"/>
+        </w:rPr>
+        <w:t xml:space="preserve"> </w:t>
       </w:r>
       <w:proofErr w:type="spellStart"/>
       <w:r>
@@ -24307,98 +24307,98 @@
         <w:rPr>
           <w:lang w:val="en-ID"/>
         </w:rPr>
-        <w:t>melonjak</w:t>
-      </w:r>
-      <w:proofErr w:type="spellEnd"/>
-      <w:r>
-        <w:rPr>
-          <w:lang w:val="en-ID"/>
-        </w:rPr>
-        <w:t xml:space="preserve"> </w:t>
-      </w:r>
-      <w:proofErr w:type="spellStart"/>
-      <w:r>
-        <w:rPr>
-          <w:lang w:val="en-ID"/>
-        </w:rPr>
-        <w:t>antara</w:t>
-      </w:r>
-      <w:proofErr w:type="spellEnd"/>
-      <w:r>
-        <w:rPr>
-          <w:lang w:val="en-ID"/>
-        </w:rPr>
-        <w:t xml:space="preserve"> </w:t>
-      </w:r>
-      <w:proofErr w:type="spellStart"/>
-      <w:r>
-        <w:rPr>
-          <w:lang w:val="en-ID"/>
-        </w:rPr>
-        <w:t>hari</w:t>
-      </w:r>
-      <w:proofErr w:type="spellEnd"/>
-      <w:r>
-        <w:rPr>
-          <w:lang w:val="en-ID"/>
-        </w:rPr>
-        <w:t xml:space="preserve"> ke-3 dan ke-7, </w:t>
-      </w:r>
-      <w:proofErr w:type="spellStart"/>
-      <w:r>
-        <w:rPr>
-          <w:lang w:val="en-ID"/>
-        </w:rPr>
-        <w:t>lalu</w:t>
-      </w:r>
-      <w:proofErr w:type="spellEnd"/>
-      <w:r>
-        <w:rPr>
-          <w:lang w:val="en-ID"/>
-        </w:rPr>
-        <w:t xml:space="preserve"> </w:t>
-      </w:r>
-      <w:proofErr w:type="spellStart"/>
-      <w:r>
-        <w:rPr>
-          <w:lang w:val="en-ID"/>
-        </w:rPr>
-        <w:t>jenuh</w:t>
-      </w:r>
-      <w:proofErr w:type="spellEnd"/>
-      <w:r>
-        <w:rPr>
-          <w:lang w:val="en-ID"/>
-        </w:rPr>
-        <w:t xml:space="preserve"> </w:t>
-      </w:r>
-      <w:proofErr w:type="spellStart"/>
-      <w:r>
-        <w:rPr>
-          <w:lang w:val="en-ID"/>
-        </w:rPr>
-        <w:t>setelah</w:t>
-      </w:r>
-      <w:proofErr w:type="spellEnd"/>
-      <w:r>
-        <w:rPr>
-          <w:lang w:val="en-ID"/>
-        </w:rPr>
-        <w:t xml:space="preserve"> </w:t>
-      </w:r>
-      <w:proofErr w:type="spellStart"/>
-      <w:r>
-        <w:rPr>
-          <w:lang w:val="en-ID"/>
-        </w:rPr>
-        <w:t>hari</w:t>
-      </w:r>
-      <w:proofErr w:type="spellEnd"/>
-      <w:r>
-        <w:rPr>
-          <w:lang w:val="en-ID"/>
-        </w:rPr>
-        <w:t xml:space="preserve"> ke-8. </w:t>
+        <w:t xml:space="preserve">melonjak begitu telat masuk 4–7 hari, lalu jenuh setelah hari ke-8.</w:t>
+      </w:r>
+      <w:proofErr w:type="spellEnd"/>
+      <w:r>
+        <w:rPr>
+          <w:lang w:val="en-ID"/>
+        </w:rPr>
+        <w:t xml:space="preserve"/>
+      </w:r>
+      <w:proofErr w:type="spellStart"/>
+      <w:r>
+        <w:rPr>
+          <w:lang w:val="en-ID"/>
+        </w:rPr>
+        <w:t xml:space="preserve"/>
+      </w:r>
+      <w:proofErr w:type="spellEnd"/>
+      <w:r>
+        <w:rPr>
+          <w:lang w:val="en-ID"/>
+        </w:rPr>
+        <w:t xml:space="preserve"/>
+      </w:r>
+      <w:proofErr w:type="spellStart"/>
+      <w:r>
+        <w:rPr>
+          <w:lang w:val="en-ID"/>
+        </w:rPr>
+        <w:t xml:space="preserve"/>
+      </w:r>
+      <w:proofErr w:type="spellEnd"/>
+      <w:r>
+        <w:rPr>
+          <w:lang w:val="en-ID"/>
+        </w:rPr>
+        <w:t xml:space="preserve"/>
+      </w:r>
+      <w:proofErr w:type="spellStart"/>
+      <w:r>
+        <w:rPr>
+          <w:lang w:val="en-ID"/>
+        </w:rPr>
+        <w:t xml:space="preserve"/>
+      </w:r>
+      <w:proofErr w:type="spellEnd"/>
+      <w:r>
+        <w:rPr>
+          <w:lang w:val="en-ID"/>
+        </w:rPr>
+        <w:t xml:space="preserve"/>
+      </w:r>
+      <w:proofErr w:type="spellStart"/>
+      <w:r>
+        <w:rPr>
+          <w:lang w:val="en-ID"/>
+        </w:rPr>
+        <w:t xml:space="preserve"/>
+      </w:r>
+      <w:proofErr w:type="spellEnd"/>
+      <w:r>
+        <w:rPr>
+          <w:lang w:val="en-ID"/>
+        </w:rPr>
+        <w:t xml:space="preserve"/>
+      </w:r>
+      <w:proofErr w:type="spellStart"/>
+      <w:r>
+        <w:rPr>
+          <w:lang w:val="en-ID"/>
+        </w:rPr>
+        <w:t xml:space="preserve"/>
+      </w:r>
+      <w:proofErr w:type="spellEnd"/>
+      <w:r>
+        <w:rPr>
+          <w:lang w:val="en-ID"/>
+        </w:rPr>
+        <w:t xml:space="preserve"/>
+      </w:r>
+      <w:proofErr w:type="spellStart"/>
+      <w:r>
+        <w:rPr>
+          <w:lang w:val="en-ID"/>
+        </w:rPr>
+        <w:t xml:space="preserve"/>
+      </w:r>
+      <w:proofErr w:type="spellEnd"/>
+      <w:r>
+        <w:rPr>
+          <w:lang w:val="en-ID"/>
+        </w:rPr>
+        <w:t xml:space="preserve"> </w:t>
       </w:r>
       <w:proofErr w:type="spellStart"/>
       <w:r>

</xml_diff>